<commit_message>
docs: dien cho trong bao cao Tuan 3, 4, 5
</commit_message>
<xml_diff>
--- a/docs/bao-cao-tuan-03.docx
+++ b/docs/bao-cao-tuan-03.docx
@@ -17,129 +17,6 @@
           <w:szCs w:val="34"/>
         </w:rPr>
         <w:t xml:space="preserve">Báo cáo tiến độ — Tuần 3 (24/09 – 30/09/2026)</w:t>
-      </w:r>
-    </w:p>
-    <w:p>
-      <w:pPr>
-        <w:spacing w:after="120"/>
-      </w:pPr>
-      <w:r>
-        <w:rPr>
-          <w:rFonts w:ascii="Times New Roman" w:cs="Times New Roman" w:eastAsia="Times New Roman" w:hAnsi="Times New Roman"/>
-          <w:b w:val="false"/>
-          <w:bCs w:val="false"/>
-          <w:i/>
-          <w:iCs/>
-          <w:sz w:val="22"/>
-          <w:szCs w:val="22"/>
-        </w:rPr>
-        <w:t xml:space="preserve">Soạn theo mẫu ở </w:t>
-      </w:r>
-      <w:r>
-        <w:rPr>
-          <w:rFonts w:ascii="Consolas" w:cs="Consolas" w:eastAsia="Consolas" w:hAnsi="Consolas"/>
-          <w:b w:val="false"/>
-          <w:bCs w:val="false"/>
-          <w:i/>
-          <w:iCs/>
-          <w:sz w:val="20"/>
-          <w:szCs w:val="20"/>
-        </w:rPr>
-        <w:t xml:space="preserve">mau-bao-cao-tuan.md</w:t>
-      </w:r>
-      <w:r>
-        <w:rPr>
-          <w:rFonts w:ascii="Times New Roman" w:cs="Times New Roman" w:eastAsia="Times New Roman" w:hAnsi="Times New Roman"/>
-          <w:b w:val="false"/>
-          <w:bCs w:val="false"/>
-          <w:i/>
-          <w:iCs/>
-          <w:sz w:val="22"/>
-          <w:szCs w:val="22"/>
-        </w:rPr>
-        <w:t xml:space="preserve">, cùng cách trình bày với </w:t>
-      </w:r>
-      <w:r>
-        <w:rPr>
-          <w:rFonts w:ascii="Consolas" w:cs="Consolas" w:eastAsia="Consolas" w:hAnsi="Consolas"/>
-          <w:b w:val="false"/>
-          <w:bCs w:val="false"/>
-          <w:i/>
-          <w:iCs/>
-          <w:sz w:val="20"/>
-          <w:szCs w:val="20"/>
-        </w:rPr>
-        <w:t xml:space="preserve">bao-cao-tuan-02.md</w:t>
-      </w:r>
-      <w:r>
-        <w:rPr>
-          <w:rFonts w:ascii="Times New Roman" w:cs="Times New Roman" w:eastAsia="Times New Roman" w:hAnsi="Times New Roman"/>
-          <w:b w:val="false"/>
-          <w:bCs w:val="false"/>
-          <w:i/>
-          <w:iCs/>
-          <w:sz w:val="22"/>
-          <w:szCs w:val="22"/>
-        </w:rPr>
-        <w:t xml:space="preserve">. Đây là bản nháp để Mạnh xem lại, chỉnh giọng văn theo ý mình rồi gửi/trình bày với thầy Đạo — thầy vẫn chưa chốt hình thức báo cáo chính thức, xem Mục 5 bên dưới.</w:t>
-      </w:r>
-    </w:p>
-    <w:p>
-      <w:pPr>
-        <w:spacing w:after="120"/>
-      </w:pPr>
-      <w:r>
-        <w:rPr>
-          <w:rFonts w:ascii="Times New Roman" w:cs="Times New Roman" w:eastAsia="Times New Roman" w:hAnsi="Times New Roman"/>
-          <w:b w:val="false"/>
-          <w:bCs w:val="false"/>
-          <w:i/>
-          <w:iCs/>
-          <w:sz w:val="22"/>
-          <w:szCs w:val="22"/>
-        </w:rPr>
-        <w:t xml:space="preserve">Lưu ý về ngày tháng: toàn bộ nội dung Tuần 3 (thiết kế hệ thống) đã hoàn thành sớm trong ngày 14/09/2026 — cùng ngày với Tuần 2, tức vẫn nằm trong tuần lịch của Tuần 1 (10/09–16/09), trước khi Tuần 3 (24/09–30/09) chính thức bắt đầu theo </w:t>
-      </w:r>
-      <w:r>
-        <w:rPr>
-          <w:rFonts w:ascii="Consolas" w:cs="Consolas" w:eastAsia="Consolas" w:hAnsi="Consolas"/>
-          <w:b w:val="false"/>
-          <w:bCs w:val="false"/>
-          <w:i/>
-          <w:iCs/>
-          <w:sz w:val="20"/>
-          <w:szCs w:val="20"/>
-        </w:rPr>
-        <w:t xml:space="preserve">ke-hoach-15-tuan.md</w:t>
-      </w:r>
-      <w:r>
-        <w:rPr>
-          <w:rFonts w:ascii="Times New Roman" w:cs="Times New Roman" w:eastAsia="Times New Roman" w:hAnsi="Times New Roman"/>
-          <w:b w:val="false"/>
-          <w:bCs w:val="false"/>
-          <w:i/>
-          <w:iCs/>
-          <w:sz w:val="22"/>
-          <w:szCs w:val="22"/>
-        </w:rPr>
-        <w:t xml:space="preserve">. Báo cáo này gắn nhãn "Tuần 3" vì đúng phạm vi công việc, không phải khung ngày lịch.</w:t>
-      </w:r>
-    </w:p>
-    <w:p>
-      <w:pPr>
-        <w:spacing w:after="120"/>
-      </w:pPr>
-      <w:r>
-        <w:rPr>
-          <w:rFonts w:ascii="Times New Roman" w:cs="Times New Roman" w:eastAsia="Times New Roman" w:hAnsi="Times New Roman"/>
-          <w:b w:val="false"/>
-          <w:bCs w:val="false"/>
-          <w:i/>
-          <w:iCs/>
-          <w:sz w:val="22"/>
-          <w:szCs w:val="22"/>
-        </w:rPr>
-        <w:t xml:space="preserve">Lý do báo cáo này gửi trễ hơn hẳn so với ngày hoàn thành nội dung (14/09 → hôm nay 17/09): ngay sau khi xong Tuần 3, phát sinh một nhiệm vụ riêng do anh Duy (trợ giảng phụ trách quy trình KLTN của khoa) giao — soạn tài liệu "Khảo sát hiện trạng và Nghiệp vụ" nộp trong tuần. Việc này thuộc một kênh báo cáo khác, tách biệt với thầy Đạo, nhưng chiếm hết thời gian 15–17/09 nên báo cáo Tuần 3 bị dồn lại đến hôm nay mới soạn. Đã hoàn tất xong việc đó trước khi quay lại báo cáo này.</w:t>
       </w:r>
     </w:p>
     <w:p>
@@ -510,16 +387,62 @@
       <w:r>
         <w:rPr>
           <w:rFonts w:ascii="Times New Roman" w:cs="Times New Roman" w:eastAsia="Times New Roman" w:hAnsi="Times New Roman"/>
-          <w:b/>
-          <w:bCs/>
-          <w:i w:val="false"/>
-          <w:iCs w:val="false"/>
-          <w:sz w:val="24"/>
-          <w:szCs w:val="24"/>
-          <w:highlight w:val="yellow"/>
-          <w:highlightCs w:val="yellow"/>
-        </w:rPr>
-        <w:t xml:space="preserve">[Chỗ Mạnh tự điền nếu đã làm: đã đưa các tài liệu trên vào thư mục docs/ của repo GitHub + link commit cụ thể]</w:t>
+          <w:b w:val="false"/>
+          <w:bCs w:val="false"/>
+          <w:i w:val="false"/>
+          <w:iCs w:val="false"/>
+          <w:sz w:val="24"/>
+          <w:szCs w:val="24"/>
+        </w:rPr>
+        <w:t xml:space="preserve">Đã đưa lên repo GitHub (ngày 21/09/2026, sau ngày soạn báo cáo): </w:t>
+      </w:r>
+      <w:r>
+        <w:rPr>
+          <w:rFonts w:ascii="Consolas" w:cs="Consolas" w:eastAsia="Consolas" w:hAnsi="Consolas"/>
+          <w:b w:val="false"/>
+          <w:bCs w:val="false"/>
+          <w:i w:val="false"/>
+          <w:iCs w:val="false"/>
+          <w:sz w:val="22"/>
+          <w:szCs w:val="22"/>
+        </w:rPr>
+        <w:t xml:space="preserve">docs/dac-ta-yeu-cau.md</w:t>
+      </w:r>
+      <w:r>
+        <w:rPr>
+          <w:rFonts w:ascii="Times New Roman" w:cs="Times New Roman" w:eastAsia="Times New Roman" w:hAnsi="Times New Roman"/>
+          <w:b w:val="false"/>
+          <w:bCs w:val="false"/>
+          <w:i w:val="false"/>
+          <w:iCs w:val="false"/>
+          <w:sz w:val="24"/>
+          <w:szCs w:val="24"/>
+        </w:rPr>
+        <w:t xml:space="preserve"> (có đủ Mục 8–12, 6 sơ đồ nhúng trong file) và </w:t>
+      </w:r>
+      <w:r>
+        <w:rPr>
+          <w:rFonts w:ascii="Consolas" w:cs="Consolas" w:eastAsia="Consolas" w:hAnsi="Consolas"/>
+          <w:b w:val="false"/>
+          <w:bCs w:val="false"/>
+          <w:i w:val="false"/>
+          <w:iCs w:val="false"/>
+          <w:sz w:val="22"/>
+          <w:szCs w:val="22"/>
+        </w:rPr>
+        <w:t xml:space="preserve">docs/coding-convention.md</w:t>
+      </w:r>
+      <w:r>
+        <w:rPr>
+          <w:rFonts w:ascii="Times New Roman" w:cs="Times New Roman" w:eastAsia="Times New Roman" w:hAnsi="Times New Roman"/>
+          <w:b w:val="false"/>
+          <w:bCs w:val="false"/>
+          <w:i w:val="false"/>
+          <w:iCs w:val="false"/>
+          <w:sz w:val="24"/>
+          <w:szCs w:val="24"/>
+        </w:rPr>
+        <w:t xml:space="preserve">, commit fdad447: https://github.com/ngocmanhnct/fashion-recommender-shop/commit/fdad447</w:t>
       </w:r>
     </w:p>
     <w:p>

</xml_diff>